<commit_message>
docs: update report to reflect final website (7 pages, Morandi palette, full API with POST/DELETE and is_custom protection)
</commit_message>
<xml_diff>
--- a/report/PROG2002 A2 Report.docx
+++ b/report/PROG2002 A2 Report.docx
@@ -23,13 +23,13 @@
     <w:p/>
     <w:p>
       <w:r>
-        <w:t>Student ID:</w:t>
+        <w:t>Student ID: 24832368</w:t>
         <w:tab/>
         <w:tab/>
-        <w:t>Last Name:</w:t>
+        <w:t>Last Name: Li</w:t>
         <w:tab/>
         <w:tab/>
-        <w:t>First Name:</w:t>
+        <w:t>First Name: Suping</w:t>
       </w:r>
     </w:p>
     <w:p/>
@@ -125,12 +125,12 @@
     </w:p>
     <w:p>
       <w:r>
-        <w:t>Client Tier (Front-End): Built with HTML5, CSS3, and vanilla JavaScript (including DOM manipulation and the Fetch API with Promises), the client provides three pages — Home, Search, and Event Detail — that render data retrieved from the server.</w:t>
+        <w:t>Client Tier (Front-End): Built with HTML5, CSS3, and vanilla JavaScript (including DOM manipulation and the Fetch API with Promises), the client provides seven pages — Home, Search, Event Detail, About, Rescue Stories, Our Impact, and Adopt — that render data retrieved from the server, plus a Manage page for adding and deleting custom categories and events.</w:t>
       </w:r>
     </w:p>
     <w:p>
       <w:r>
-        <w:t>Server Tier (Middle Tier): Built with Node.js and Express.js, the server exposes a RESTful API that handles HTTP GET requests and returns JSON responses. The server contains no business logic beyond query construction and result formatting.</w:t>
+        <w:t>Server Tier (Middle Tier): Built with Node.js and Express.js, the server exposes a RESTful API that handles HTTP GET, POST and DELETE requests and returns JSON responses. The server contains no business logic beyond query construction and result formatting.</w:t>
       </w:r>
     </w:p>
     <w:p>
@@ -169,7 +169,7 @@
     </w:p>
     <w:p>
       <w:r>
-        <w:t>2. Visual Design: A professional colour palette (deep navy #1e3a5f for trust, warm orange #e67e22 for call-to-action buttons, off-white background) evokes the warmth and professionalism expected of a charitable platform. Card-based layouts with subtle shadows and hover effects create a modern, approachable feel.</w:t>
+        <w:t>2. Visual Design: A warm Morandi colour palette with more than five harmonious colours (mocha, terracotta, sage, misty blue, dusty rose, lavender, maple lavender and warm yellow) gives the platform a soft, professional and welcoming feel. Category badges use five distinct Morandi colours with a playful cartoon font so users can recognise event types at a glance, and the homepage hero image automatically rotates through three themed slides. Card-based layouts with subtle shadows and hover effects create a modern, approachable feel.</w:t>
       </w:r>
     </w:p>
     <w:p>
@@ -194,7 +194,7 @@
     </w:p>
     <w:p>
       <w:r>
-        <w:t>7. Card-Based Event Listings: Each event card displays the most decision-relevant information — title, category badge, date, location, and price — before requiring a click to see full details. This respects users time and reduces cognitive load.</w:t>
+        <w:t>7. Card-Based Event Listings: Each event card displays the most decision-relevant information — title, category badge, date, location, and price — before requiring a click to see full details. Selected event types (fun runs, galas, concerts, pet walks, auctions and community fairs) feature an animated stacked photo carousel that rotates automatically and can be navigated with clickable dots. This respects users' time and reduces cognitive load.</w:t>
       </w:r>
     </w:p>
     <w:p/>
@@ -223,7 +223,7 @@
     </w:p>
     <w:p>
       <w:r>
-        <w:t>Table 3: events — The main fact table. Columns: event_id (PK), org_id (FK to organisations), category_id (FK to categories), title, description, event_date, start_time, end_time, location, address, city, ticket_price, capacity, goal_amount, raised_amount, status (ENUM: active/suspended/past), image_url, created_at, updated_at.</w:t>
+        <w:t>Table 3: events — The main fact table. Columns: event_id (PK), org_id (FK to organisations), category_id (FK to categories), title, description, event_date, start_time, end_time, location, address, city, ticket_price, capacity, goal_amount, raised_amount, status (ENUM: active/suspended/past), image_url, is_custom, created_at, updated_at. The is_custom flag distinguishes seed data (0, protected) from user-created records (1, deletable).</w:t>
       </w:r>
     </w:p>
     <w:p>
@@ -233,7 +233,7 @@
     </w:p>
     <w:p>
       <w:r>
-        <w:t>Status field design: The status ENUM allows the application to distinguish active events (shown on the home page), suspended events (hidden from public view), and past events. Combined with event_date &gt;= CURDATE() in queries, this ensures only upcoming, active events are displayed — directly satisfying the assignment requirement to mark events as past or upcoming.</w:t>
+        <w:t>Status field design: The status ENUM allows the application to distinguish active events (shown on the home page), suspended events (hidden from public view), and past events. Combined with event_date &gt;= CURDATE() in queries, this ensures only upcoming, active events are displayed — directly satisfying the assignment requirement to mark events as past or upcoming. The is_custom flag on both categories and events powers the management page's protected-deletion feature: users can add and delete their own records, while the initial seeded data always returns a 403 Forbidden response.</w:t>
       </w:r>
     </w:p>
     <w:p>
@@ -252,7 +252,7 @@
     </w:p>
     <w:p>
       <w:r>
-        <w:t>The RESTful API is built with Express.js and exposes four GET endpoints under the /api/events namespace. All endpoints return JSON responses with a consistent structure ({ success, count/meta, data }).</w:t>
+        <w:t>The RESTful API is built with Express.js and exposes read, create and delete endpoints under the /api/events and /api/categories namespaces. All endpoints return JSON responses with a consistent structure ({ success, count/meta, data }).</w:t>
       </w:r>
     </w:p>
     <w:p>
@@ -262,7 +262,7 @@
     </w:p>
     <w:p>
       <w:r>
-        <w:t xml:space="preserve">  GET /api/events — Returns all active and upcoming events (ordered by date ascending), joined with category and organisation names. Used on the Home page.</w:t>
+        <w:t>GET /api/events — Returns all active and upcoming events (ordered by date ascending), joined with category and organisation names. Used on the Home page.</w:t>
       </w:r>
     </w:p>
     <w:p>
@@ -277,7 +277,47 @@
     </w:p>
     <w:p>
       <w:r>
-        <w:t xml:space="preserve">  GET /api/categories — Returns all event categories. Used to populate the search filter dropdown.</w:t>
+        <w:t>GET /api/categories — Returns all event categories. Used to populate the search filter dropdown and the Manage page.</w:t>
+      </w:r>
+    </w:p>
+    <w:p>
+      <w:pPr>
+        <w:ind w:left="720"/>
+      </w:pPr>
+      <w:r>
+        <w:t xml:space="preserve">POST /api/events — Creates a new event with is_custom = 1 (used by the Manage page).</w:t>
+      </w:r>
+    </w:p>
+    <w:p>
+      <w:pPr>
+        <w:ind w:left="720"/>
+      </w:pPr>
+      <w:r>
+        <w:t xml:space="preserve">POST /api/categories — Creates a new category with is_custom = 1 (used by the Manage page).</w:t>
+      </w:r>
+    </w:p>
+    <w:p>
+      <w:pPr>
+        <w:ind w:left="720"/>
+      </w:pPr>
+      <w:r>
+        <w:t xml:space="preserve">DELETE /api/events/:id — Deletes a custom event; returns 403 if the record is protected seed data.</w:t>
+      </w:r>
+    </w:p>
+    <w:p>
+      <w:pPr>
+        <w:ind w:left="720"/>
+      </w:pPr>
+      <w:r>
+        <w:t xml:space="preserve">DELETE /api/categories/:id — Deletes a custom category; returns 403 if the record is protected seed data.</w:t>
+      </w:r>
+    </w:p>
+    <w:p>
+      <w:pPr>
+        <w:ind w:left="720"/>
+      </w:pPr>
+      <w:r>
+        <w:t xml:space="preserve">GET /api/events/all — Returns every event regardless of status (used by the Manage page).</w:t>
       </w:r>
     </w:p>
     <w:p>
@@ -312,12 +352,12 @@
     </w:p>
     <w:p>
       <w:r>
-        <w:t xml:space="preserve">  All endpoints use GET because this assessment only requires read operations. GET is the correct HTTP method for retrieving representations of resources — it is safe (does not modify data), idempotent (multiple identical requests have the same effect), and cacheable. Using GET also allows users to bookmark or share search results via the URL.</w:t>
+        <w:t>GET is used for all read-only operations (listing, searching and fetching events and categories) because these requests only retrieve data and do not change server state, which makes them safe and cacheable. Using GET also allows users to bookmark or share search results via the URL.</w:t>
       </w:r>
     </w:p>
     <w:p>
       <w:r>
-        <w:t xml:space="preserve">  POST, PUT, and DELETE are intentionally not implemented in this assessment because the brief explicitly states these will be developed in Assessment 3. The API design is structured so that adding these methods in the future will be straightforward — resources are already identified by URI, and the Express router pattern is in place.</w:t>
+        <w:t>POST is used to create new events and categories because each submission creates a new record with a new ID, and POST is not idempotent. DELETE is used to remove custom records, and it is idempotent — deleting the same record twice has the same effect. Protected seed data (is_custom = 0) is safeguarded at the API level with a 403 Forbidden response. PUT is not used because the assessment does not require partial updates of existing records; if editing were added in Assessment 3, PUT would be the natural choice.</w:t>
       </w:r>
     </w:p>
     <w:sectPr>
@@ -326,6 +366,21 @@
       <w:cols w:space="720"/>
       <w:docGrid w:linePitch="360"/>
     </w:sectPr>
+    <w:p>
+      <w:r>
+        <w:t xml:space="preserve"/>
+      </w:r>
+    </w:p>
+    <w:p>
+      <w:r>
+        <w:t xml:space="preserve">GenAI Use Declaration</w:t>
+      </w:r>
+    </w:p>
+    <w:p>
+      <w:r>
+        <w:t xml:space="preserve">I acknowledge that I have used GenAI tools to complete this assessment. I used Doubao (an AI assistant) to brainstorm ideas, check grammar, paraphrase for clarity, and format the project documentation within the parameters outlined in the Assessment Brief and by the Unit Assessor.</w:t>
+      </w:r>
+    </w:p>
   </w:body>
 </w:document>
 </file>

</xml_diff>